<commit_message>
chore: check report content
</commit_message>
<xml_diff>
--- a/stime_delphi_piano.docx
+++ b/stime_delphi_piano.docx
@@ -23,7 +23,7 @@
           <w:color w:val="666666"/>
           <w:sz w:val="18"/>
         </w:rPr>
-        <w:t>Generato il 2026-05-28 14:12  |  Durata = ⌈Effort / (8 ore × 85%)⌉ giorni</w:t>
+        <w:t>Generato il 2026-05-29 15:11  |  Durata = ⌈Effort / (8 ore × 85%)⌉ giorni</w:t>
       </w:r>
     </w:p>
     <w:tbl>
@@ -15258,7 +15258,7 @@
                 <w:color w:val="595959"/>
                 <w:sz w:val="16"/>
               </w:rPr>
-              <w:t>04/02/2026</w:t>
+              <w:t>07/04/2026</w:t>
             </w:r>
           </w:p>
         </w:tc>
@@ -15277,7 +15277,7 @@
                 <w:color w:val="595959"/>
                 <w:sz w:val="16"/>
               </w:rPr>
-              <w:t>30/03/2026</w:t>
+              <w:t>30/04/2026</w:t>
             </w:r>
           </w:p>
         </w:tc>
@@ -15419,7 +15419,7 @@
                 <w:color w:val="595959"/>
                 <w:sz w:val="16"/>
               </w:rPr>
-              <w:t>04/02/2026</w:t>
+              <w:t>07/04/2026</w:t>
             </w:r>
           </w:p>
         </w:tc>
@@ -15438,7 +15438,7 @@
                 <w:color w:val="595959"/>
                 <w:sz w:val="16"/>
               </w:rPr>
-              <w:t>30/03/2026</w:t>
+              <w:t>30/04/2026</w:t>
             </w:r>
           </w:p>
         </w:tc>
@@ -15580,7 +15580,7 @@
                 <w:color w:val="595959"/>
                 <w:sz w:val="16"/>
               </w:rPr>
-              <w:t>04/02/2026</w:t>
+              <w:t>07/04/2026</w:t>
             </w:r>
           </w:p>
         </w:tc>
@@ -15599,7 +15599,7 @@
                 <w:color w:val="595959"/>
                 <w:sz w:val="16"/>
               </w:rPr>
-              <w:t>30/03/2026</w:t>
+              <w:t>30/04/2026</w:t>
             </w:r>
           </w:p>
         </w:tc>
@@ -15865,7 +15865,7 @@
                 <w:color w:val="595959"/>
                 <w:sz w:val="16"/>
               </w:rPr>
-              <w:t>93, 94, 96</w:t>
+              <w:t>93, 94, 95,  96</w:t>
             </w:r>
           </w:p>
         </w:tc>
@@ -15903,7 +15903,7 @@
                 <w:color w:val="595959"/>
                 <w:sz w:val="16"/>
               </w:rPr>
-              <w:t>31/03/2026</w:t>
+              <w:t>30/04/2026</w:t>
             </w:r>
           </w:p>
         </w:tc>
@@ -15922,7 +15922,7 @@
                 <w:color w:val="595959"/>
                 <w:sz w:val="16"/>
               </w:rPr>
-              <w:t>31/03/2026</w:t>
+              <w:t>30/04/2026</w:t>
             </w:r>
           </w:p>
         </w:tc>
@@ -16065,7 +16065,7 @@
                 <w:color w:val="595959"/>
                 <w:sz w:val="16"/>
               </w:rPr>
-              <w:t>08/04/2026</w:t>
+              <w:t>04/05/2026</w:t>
             </w:r>
           </w:p>
         </w:tc>

</xml_diff>